<commit_message>
chore(Fiber): 成分分析 Multi/Single 模板增加 per 列书签
- Multi/Single结果表分成两列
- 文字零改动; Single 页脚结构重整, footer4 删除
</commit_message>
<xml_diff>
--- a/wwwroot/DocxModel/Common_FIBER/FIBER_ANALYSIS_DATA_SHEET_Multi.docx
+++ b/wwwroot/DocxModel/Common_FIBER/FIBER_ANALYSIS_DATA_SHEET_Multi.docx
@@ -3519,7 +3519,7 @@
     </w:p>
     <w:tbl>
       <w:tblPr>
-        <w:tblW w:w="10916" w:type="dxa"/>
+        <w:tblW w:w="11057" w:type="dxa"/>
         <w:tblInd w:w="-284" w:type="dxa"/>
         <w:tblLayout w:type="fixed"/>
         <w:tblLook w:val="04A0" w:firstRow="1" w:lastRow="0" w:firstColumn="1" w:lastColumn="0" w:noHBand="0" w:noVBand="1"/>
@@ -3527,9 +3527,11 @@
       <w:tblGrid>
         <w:gridCol w:w="284"/>
         <w:gridCol w:w="1985"/>
-        <w:gridCol w:w="3402"/>
+        <w:gridCol w:w="992"/>
+        <w:gridCol w:w="2410"/>
         <w:gridCol w:w="1843"/>
-        <w:gridCol w:w="3402"/>
+        <w:gridCol w:w="992"/>
+        <w:gridCol w:w="2551"/>
       </w:tblGrid>
       <w:tr>
         <w:trPr>
@@ -3605,7 +3607,28 @@
         </w:tc>
         <w:tc>
           <w:tcPr>
-            <w:tcW w:w="3402" w:type="dxa"/>
+            <w:tcW w:w="992" w:type="dxa"/>
+            <w:vAlign w:val="center"/>
+          </w:tcPr>
+          <w:p>
+            <w:pPr>
+              <w:pStyle w:val="aa"/>
+              <w:jc w:val="right"/>
+              <w:rPr>
+                <w:rFonts w:ascii="Arial" w:hAnsi="Arial" w:cs="Arial" w:hint="eastAsia"/>
+                <w:bCs/>
+                <w:sz w:val="18"/>
+                <w:szCs w:val="18"/>
+              </w:rPr>
+            </w:pPr>
+            <w:bookmarkStart w:id="152" w:name="TestResultper_1"/>
+            <w:bookmarkEnd w:id="152"/>
+          </w:p>
+        </w:tc>
+        <w:tc>
+          <w:tcPr>
+            <w:tcW w:w="2410" w:type="dxa"/>
+            <w:vAlign w:val="center"/>
           </w:tcPr>
           <w:p>
             <w:pPr>
@@ -3617,8 +3640,8 @@
                 <w:szCs w:val="18"/>
               </w:rPr>
             </w:pPr>
-            <w:bookmarkStart w:id="152" w:name="TestResult_1"/>
-            <w:bookmarkEnd w:id="152"/>
+            <w:bookmarkStart w:id="153" w:name="TestResult_1"/>
+            <w:bookmarkEnd w:id="153"/>
           </w:p>
         </w:tc>
         <w:tc>
@@ -3646,13 +3669,34 @@
               </w:rPr>
               <w:t>Recommendation:</w:t>
             </w:r>
-            <w:bookmarkStart w:id="153" w:name="Recommend"/>
-            <w:bookmarkEnd w:id="153"/>
-          </w:p>
-        </w:tc>
-        <w:tc>
-          <w:tcPr>
-            <w:tcW w:w="3402" w:type="dxa"/>
+            <w:bookmarkStart w:id="154" w:name="Recommend"/>
+            <w:bookmarkEnd w:id="154"/>
+          </w:p>
+        </w:tc>
+        <w:tc>
+          <w:tcPr>
+            <w:tcW w:w="992" w:type="dxa"/>
+            <w:vAlign w:val="center"/>
+          </w:tcPr>
+          <w:p>
+            <w:pPr>
+              <w:pStyle w:val="aa"/>
+              <w:jc w:val="right"/>
+              <w:rPr>
+                <w:rFonts w:ascii="Arial" w:hAnsi="Arial" w:cs="Arial" w:hint="eastAsia"/>
+                <w:bCs/>
+                <w:sz w:val="18"/>
+                <w:szCs w:val="18"/>
+              </w:rPr>
+            </w:pPr>
+            <w:bookmarkStart w:id="155" w:name="Recommendationper_1"/>
+            <w:bookmarkEnd w:id="155"/>
+          </w:p>
+        </w:tc>
+        <w:tc>
+          <w:tcPr>
+            <w:tcW w:w="2551" w:type="dxa"/>
+            <w:vAlign w:val="center"/>
           </w:tcPr>
           <w:p>
             <w:pPr>
@@ -3665,8 +3709,8 @@
                 <w:szCs w:val="18"/>
               </w:rPr>
             </w:pPr>
-            <w:bookmarkStart w:id="154" w:name="Recommendation_1"/>
-            <w:bookmarkEnd w:id="154"/>
+            <w:bookmarkStart w:id="156" w:name="Recommendation_1"/>
+            <w:bookmarkEnd w:id="156"/>
           </w:p>
         </w:tc>
       </w:tr>
@@ -3695,7 +3739,28 @@
         </w:tc>
         <w:tc>
           <w:tcPr>
-            <w:tcW w:w="3402" w:type="dxa"/>
+            <w:tcW w:w="992" w:type="dxa"/>
+            <w:vAlign w:val="center"/>
+          </w:tcPr>
+          <w:p>
+            <w:pPr>
+              <w:pStyle w:val="aa"/>
+              <w:jc w:val="right"/>
+              <w:rPr>
+                <w:rFonts w:ascii="Arial" w:hAnsi="Arial" w:cs="Arial" w:hint="eastAsia"/>
+                <w:bCs/>
+                <w:sz w:val="18"/>
+                <w:szCs w:val="18"/>
+              </w:rPr>
+            </w:pPr>
+            <w:bookmarkStart w:id="157" w:name="TestResultper_2"/>
+            <w:bookmarkEnd w:id="157"/>
+          </w:p>
+        </w:tc>
+        <w:tc>
+          <w:tcPr>
+            <w:tcW w:w="2410" w:type="dxa"/>
+            <w:vAlign w:val="center"/>
           </w:tcPr>
           <w:p>
             <w:pPr>
@@ -3707,8 +3772,8 @@
                 <w:szCs w:val="18"/>
               </w:rPr>
             </w:pPr>
-            <w:bookmarkStart w:id="155" w:name="TestResult_2"/>
-            <w:bookmarkEnd w:id="155"/>
+            <w:bookmarkStart w:id="158" w:name="TestResult_2"/>
+            <w:bookmarkEnd w:id="158"/>
           </w:p>
         </w:tc>
         <w:tc>
@@ -3726,17 +3791,19 @@
                 <w:szCs w:val="18"/>
               </w:rPr>
             </w:pPr>
-            <w:bookmarkStart w:id="156" w:name="GBR"/>
-            <w:bookmarkEnd w:id="156"/>
-          </w:p>
-        </w:tc>
-        <w:tc>
-          <w:tcPr>
-            <w:tcW w:w="3402" w:type="dxa"/>
+            <w:bookmarkStart w:id="159" w:name="GBR"/>
+            <w:bookmarkEnd w:id="159"/>
+          </w:p>
+        </w:tc>
+        <w:tc>
+          <w:tcPr>
+            <w:tcW w:w="992" w:type="dxa"/>
+            <w:vAlign w:val="center"/>
           </w:tcPr>
           <w:p>
             <w:pPr>
               <w:pStyle w:val="aa"/>
+              <w:jc w:val="right"/>
               <w:rPr>
                 <w:rFonts w:ascii="Arial" w:hAnsi="Arial" w:cs="Arial"/>
                 <w:bCs/>
@@ -3744,12 +3811,31 @@
                 <w:szCs w:val="18"/>
               </w:rPr>
             </w:pPr>
-            <w:bookmarkStart w:id="157" w:name="Recommendation_2"/>
-            <w:bookmarkEnd w:id="157"/>
-          </w:p>
-        </w:tc>
-        <w:bookmarkStart w:id="158" w:name="FinalRemark"/>
-        <w:bookmarkEnd w:id="158"/>
+            <w:bookmarkStart w:id="160" w:name="Recommendationper_2"/>
+            <w:bookmarkEnd w:id="160"/>
+          </w:p>
+        </w:tc>
+        <w:tc>
+          <w:tcPr>
+            <w:tcW w:w="2551" w:type="dxa"/>
+            <w:vAlign w:val="center"/>
+          </w:tcPr>
+          <w:p>
+            <w:pPr>
+              <w:pStyle w:val="aa"/>
+              <w:rPr>
+                <w:rFonts w:ascii="Arial" w:hAnsi="Arial" w:cs="Arial"/>
+                <w:bCs/>
+                <w:sz w:val="18"/>
+                <w:szCs w:val="18"/>
+              </w:rPr>
+            </w:pPr>
+            <w:bookmarkStart w:id="161" w:name="Recommendation_2"/>
+            <w:bookmarkEnd w:id="161"/>
+          </w:p>
+        </w:tc>
+        <w:bookmarkStart w:id="162" w:name="FinalRemark"/>
+        <w:bookmarkEnd w:id="162"/>
       </w:tr>
       <w:tr>
         <w:trPr>
@@ -3771,30 +3857,33 @@
                 <w:szCs w:val="18"/>
               </w:rPr>
             </w:pPr>
-            <w:bookmarkStart w:id="159" w:name="GBTR"/>
-            <w:bookmarkEnd w:id="159"/>
-          </w:p>
-        </w:tc>
-        <w:tc>
-          <w:tcPr>
-            <w:tcW w:w="3402" w:type="dxa"/>
+            <w:bookmarkStart w:id="163" w:name="GBTR"/>
+            <w:bookmarkEnd w:id="163"/>
+          </w:p>
+        </w:tc>
+        <w:tc>
+          <w:tcPr>
+            <w:tcW w:w="992" w:type="dxa"/>
+            <w:vAlign w:val="center"/>
           </w:tcPr>
           <w:p>
             <w:pPr>
               <w:pStyle w:val="aa"/>
+              <w:jc w:val="right"/>
               <w:rPr>
                 <w:noProof/>
                 <w:sz w:val="21"/>
                 <w:szCs w:val="21"/>
               </w:rPr>
             </w:pPr>
-            <w:bookmarkStart w:id="160" w:name="TestResult_3"/>
-            <w:bookmarkEnd w:id="160"/>
-          </w:p>
-        </w:tc>
-        <w:tc>
-          <w:tcPr>
-            <w:tcW w:w="1843" w:type="dxa"/>
+            <w:bookmarkStart w:id="164" w:name="TestResultper_3"/>
+            <w:bookmarkEnd w:id="164"/>
+          </w:p>
+        </w:tc>
+        <w:tc>
+          <w:tcPr>
+            <w:tcW w:w="2410" w:type="dxa"/>
+            <w:vAlign w:val="center"/>
           </w:tcPr>
           <w:p>
             <w:pPr>
@@ -3805,11 +3894,13 @@
                 <w:szCs w:val="21"/>
               </w:rPr>
             </w:pPr>
-          </w:p>
-        </w:tc>
-        <w:tc>
-          <w:tcPr>
-            <w:tcW w:w="3402" w:type="dxa"/>
+            <w:bookmarkStart w:id="165" w:name="TestResult_3"/>
+            <w:bookmarkEnd w:id="165"/>
+          </w:p>
+        </w:tc>
+        <w:tc>
+          <w:tcPr>
+            <w:tcW w:w="1843" w:type="dxa"/>
           </w:tcPr>
           <w:p>
             <w:pPr>
@@ -3820,8 +3911,43 @@
                 <w:szCs w:val="21"/>
               </w:rPr>
             </w:pPr>
-            <w:bookmarkStart w:id="161" w:name="Recommendation_3"/>
-            <w:bookmarkEnd w:id="161"/>
+          </w:p>
+        </w:tc>
+        <w:tc>
+          <w:tcPr>
+            <w:tcW w:w="992" w:type="dxa"/>
+            <w:vAlign w:val="center"/>
+          </w:tcPr>
+          <w:p>
+            <w:pPr>
+              <w:pStyle w:val="aa"/>
+              <w:jc w:val="right"/>
+              <w:rPr>
+                <w:noProof/>
+                <w:sz w:val="21"/>
+                <w:szCs w:val="21"/>
+              </w:rPr>
+            </w:pPr>
+            <w:bookmarkStart w:id="166" w:name="Recommendationper_3"/>
+            <w:bookmarkEnd w:id="166"/>
+          </w:p>
+        </w:tc>
+        <w:tc>
+          <w:tcPr>
+            <w:tcW w:w="2551" w:type="dxa"/>
+            <w:vAlign w:val="center"/>
+          </w:tcPr>
+          <w:p>
+            <w:pPr>
+              <w:pStyle w:val="aa"/>
+              <w:rPr>
+                <w:noProof/>
+                <w:sz w:val="21"/>
+                <w:szCs w:val="21"/>
+              </w:rPr>
+            </w:pPr>
+            <w:bookmarkStart w:id="167" w:name="Recommendation_3"/>
+            <w:bookmarkEnd w:id="167"/>
           </w:p>
         </w:tc>
       </w:tr>
@@ -3849,24 +3975,27 @@
         </w:tc>
         <w:tc>
           <w:tcPr>
-            <w:tcW w:w="3402" w:type="dxa"/>
+            <w:tcW w:w="992" w:type="dxa"/>
+            <w:vAlign w:val="center"/>
           </w:tcPr>
           <w:p>
             <w:pPr>
               <w:pStyle w:val="aa"/>
+              <w:jc w:val="right"/>
               <w:rPr>
                 <w:noProof/>
                 <w:sz w:val="21"/>
                 <w:szCs w:val="21"/>
               </w:rPr>
             </w:pPr>
-            <w:bookmarkStart w:id="162" w:name="TestResult_4"/>
-            <w:bookmarkEnd w:id="162"/>
-          </w:p>
-        </w:tc>
-        <w:tc>
-          <w:tcPr>
-            <w:tcW w:w="1843" w:type="dxa"/>
+            <w:bookmarkStart w:id="168" w:name="TestResultper_4"/>
+            <w:bookmarkEnd w:id="168"/>
+          </w:p>
+        </w:tc>
+        <w:tc>
+          <w:tcPr>
+            <w:tcW w:w="2410" w:type="dxa"/>
+            <w:vAlign w:val="center"/>
           </w:tcPr>
           <w:p>
             <w:pPr>
@@ -3877,11 +4006,13 @@
                 <w:szCs w:val="21"/>
               </w:rPr>
             </w:pPr>
-          </w:p>
-        </w:tc>
-        <w:tc>
-          <w:tcPr>
-            <w:tcW w:w="3402" w:type="dxa"/>
+            <w:bookmarkStart w:id="169" w:name="TestResult_4"/>
+            <w:bookmarkEnd w:id="169"/>
+          </w:p>
+        </w:tc>
+        <w:tc>
+          <w:tcPr>
+            <w:tcW w:w="1843" w:type="dxa"/>
           </w:tcPr>
           <w:p>
             <w:pPr>
@@ -3892,8 +4023,43 @@
                 <w:szCs w:val="21"/>
               </w:rPr>
             </w:pPr>
-            <w:bookmarkStart w:id="163" w:name="Recommendation_4"/>
-            <w:bookmarkEnd w:id="163"/>
+          </w:p>
+        </w:tc>
+        <w:tc>
+          <w:tcPr>
+            <w:tcW w:w="992" w:type="dxa"/>
+            <w:vAlign w:val="center"/>
+          </w:tcPr>
+          <w:p>
+            <w:pPr>
+              <w:pStyle w:val="aa"/>
+              <w:jc w:val="right"/>
+              <w:rPr>
+                <w:noProof/>
+                <w:sz w:val="21"/>
+                <w:szCs w:val="21"/>
+              </w:rPr>
+            </w:pPr>
+            <w:bookmarkStart w:id="170" w:name="Recommendationper_4"/>
+            <w:bookmarkEnd w:id="170"/>
+          </w:p>
+        </w:tc>
+        <w:tc>
+          <w:tcPr>
+            <w:tcW w:w="2551" w:type="dxa"/>
+            <w:vAlign w:val="center"/>
+          </w:tcPr>
+          <w:p>
+            <w:pPr>
+              <w:pStyle w:val="aa"/>
+              <w:rPr>
+                <w:noProof/>
+                <w:sz w:val="21"/>
+                <w:szCs w:val="21"/>
+              </w:rPr>
+            </w:pPr>
+            <w:bookmarkStart w:id="171" w:name="Recommendation_4"/>
+            <w:bookmarkEnd w:id="171"/>
           </w:p>
         </w:tc>
       </w:tr>
@@ -3920,24 +4086,27 @@
         </w:tc>
         <w:tc>
           <w:tcPr>
-            <w:tcW w:w="3402" w:type="dxa"/>
+            <w:tcW w:w="992" w:type="dxa"/>
+            <w:vAlign w:val="center"/>
           </w:tcPr>
           <w:p>
             <w:pPr>
               <w:pStyle w:val="aa"/>
+              <w:jc w:val="right"/>
               <w:rPr>
                 <w:noProof/>
                 <w:sz w:val="21"/>
                 <w:szCs w:val="21"/>
               </w:rPr>
             </w:pPr>
-            <w:bookmarkStart w:id="164" w:name="TestResult_5"/>
-            <w:bookmarkEnd w:id="164"/>
-          </w:p>
-        </w:tc>
-        <w:tc>
-          <w:tcPr>
-            <w:tcW w:w="1843" w:type="dxa"/>
+            <w:bookmarkStart w:id="172" w:name="TestResultper_5"/>
+            <w:bookmarkEnd w:id="172"/>
+          </w:p>
+        </w:tc>
+        <w:tc>
+          <w:tcPr>
+            <w:tcW w:w="2410" w:type="dxa"/>
+            <w:vAlign w:val="center"/>
           </w:tcPr>
           <w:p>
             <w:pPr>
@@ -3948,11 +4117,13 @@
                 <w:szCs w:val="21"/>
               </w:rPr>
             </w:pPr>
-          </w:p>
-        </w:tc>
-        <w:tc>
-          <w:tcPr>
-            <w:tcW w:w="3402" w:type="dxa"/>
+            <w:bookmarkStart w:id="173" w:name="TestResult_5"/>
+            <w:bookmarkEnd w:id="173"/>
+          </w:p>
+        </w:tc>
+        <w:tc>
+          <w:tcPr>
+            <w:tcW w:w="1843" w:type="dxa"/>
           </w:tcPr>
           <w:p>
             <w:pPr>
@@ -3963,8 +4134,43 @@
                 <w:szCs w:val="21"/>
               </w:rPr>
             </w:pPr>
-            <w:bookmarkStart w:id="165" w:name="Recommendation_5"/>
-            <w:bookmarkEnd w:id="165"/>
+          </w:p>
+        </w:tc>
+        <w:tc>
+          <w:tcPr>
+            <w:tcW w:w="992" w:type="dxa"/>
+            <w:vAlign w:val="center"/>
+          </w:tcPr>
+          <w:p>
+            <w:pPr>
+              <w:pStyle w:val="aa"/>
+              <w:jc w:val="right"/>
+              <w:rPr>
+                <w:noProof/>
+                <w:sz w:val="21"/>
+                <w:szCs w:val="21"/>
+              </w:rPr>
+            </w:pPr>
+            <w:bookmarkStart w:id="174" w:name="Recommendationper_5"/>
+            <w:bookmarkEnd w:id="174"/>
+          </w:p>
+        </w:tc>
+        <w:tc>
+          <w:tcPr>
+            <w:tcW w:w="2551" w:type="dxa"/>
+            <w:vAlign w:val="center"/>
+          </w:tcPr>
+          <w:p>
+            <w:pPr>
+              <w:pStyle w:val="aa"/>
+              <w:rPr>
+                <w:noProof/>
+                <w:sz w:val="21"/>
+                <w:szCs w:val="21"/>
+              </w:rPr>
+            </w:pPr>
+            <w:bookmarkStart w:id="175" w:name="Recommendation_5"/>
+            <w:bookmarkEnd w:id="175"/>
           </w:p>
         </w:tc>
       </w:tr>
@@ -3991,24 +4197,27 @@
         </w:tc>
         <w:tc>
           <w:tcPr>
-            <w:tcW w:w="3402" w:type="dxa"/>
+            <w:tcW w:w="992" w:type="dxa"/>
+            <w:vAlign w:val="center"/>
           </w:tcPr>
           <w:p>
             <w:pPr>
               <w:pStyle w:val="aa"/>
+              <w:jc w:val="right"/>
               <w:rPr>
                 <w:noProof/>
                 <w:sz w:val="21"/>
                 <w:szCs w:val="21"/>
               </w:rPr>
             </w:pPr>
-            <w:bookmarkStart w:id="166" w:name="TestResult_6"/>
-            <w:bookmarkEnd w:id="166"/>
-          </w:p>
-        </w:tc>
-        <w:tc>
-          <w:tcPr>
-            <w:tcW w:w="1843" w:type="dxa"/>
+            <w:bookmarkStart w:id="176" w:name="TestResultper_6"/>
+            <w:bookmarkEnd w:id="176"/>
+          </w:p>
+        </w:tc>
+        <w:tc>
+          <w:tcPr>
+            <w:tcW w:w="2410" w:type="dxa"/>
+            <w:vAlign w:val="center"/>
           </w:tcPr>
           <w:p>
             <w:pPr>
@@ -4019,11 +4228,13 @@
                 <w:szCs w:val="21"/>
               </w:rPr>
             </w:pPr>
-          </w:p>
-        </w:tc>
-        <w:tc>
-          <w:tcPr>
-            <w:tcW w:w="3402" w:type="dxa"/>
+            <w:bookmarkStart w:id="177" w:name="TestResult_6"/>
+            <w:bookmarkEnd w:id="177"/>
+          </w:p>
+        </w:tc>
+        <w:tc>
+          <w:tcPr>
+            <w:tcW w:w="1843" w:type="dxa"/>
           </w:tcPr>
           <w:p>
             <w:pPr>
@@ -4034,8 +4245,43 @@
                 <w:szCs w:val="21"/>
               </w:rPr>
             </w:pPr>
-            <w:bookmarkStart w:id="167" w:name="Recommendation_6"/>
-            <w:bookmarkEnd w:id="167"/>
+          </w:p>
+        </w:tc>
+        <w:tc>
+          <w:tcPr>
+            <w:tcW w:w="992" w:type="dxa"/>
+            <w:vAlign w:val="center"/>
+          </w:tcPr>
+          <w:p>
+            <w:pPr>
+              <w:pStyle w:val="aa"/>
+              <w:jc w:val="right"/>
+              <w:rPr>
+                <w:noProof/>
+                <w:sz w:val="21"/>
+                <w:szCs w:val="21"/>
+              </w:rPr>
+            </w:pPr>
+            <w:bookmarkStart w:id="178" w:name="Recommendationper_6"/>
+            <w:bookmarkEnd w:id="178"/>
+          </w:p>
+        </w:tc>
+        <w:tc>
+          <w:tcPr>
+            <w:tcW w:w="2551" w:type="dxa"/>
+            <w:vAlign w:val="center"/>
+          </w:tcPr>
+          <w:p>
+            <w:pPr>
+              <w:pStyle w:val="aa"/>
+              <w:rPr>
+                <w:noProof/>
+                <w:sz w:val="21"/>
+                <w:szCs w:val="21"/>
+              </w:rPr>
+            </w:pPr>
+            <w:bookmarkStart w:id="179" w:name="Recommendation_6"/>
+            <w:bookmarkEnd w:id="179"/>
           </w:p>
         </w:tc>
       </w:tr>
@@ -4062,24 +4308,27 @@
         </w:tc>
         <w:tc>
           <w:tcPr>
-            <w:tcW w:w="3402" w:type="dxa"/>
+            <w:tcW w:w="992" w:type="dxa"/>
+            <w:vAlign w:val="center"/>
           </w:tcPr>
           <w:p>
             <w:pPr>
               <w:pStyle w:val="aa"/>
+              <w:jc w:val="right"/>
               <w:rPr>
                 <w:noProof/>
                 <w:sz w:val="21"/>
                 <w:szCs w:val="21"/>
               </w:rPr>
             </w:pPr>
-            <w:bookmarkStart w:id="168" w:name="TestResult_7"/>
-            <w:bookmarkEnd w:id="168"/>
-          </w:p>
-        </w:tc>
-        <w:tc>
-          <w:tcPr>
-            <w:tcW w:w="1843" w:type="dxa"/>
+            <w:bookmarkStart w:id="180" w:name="TestResultper_7"/>
+            <w:bookmarkEnd w:id="180"/>
+          </w:p>
+        </w:tc>
+        <w:tc>
+          <w:tcPr>
+            <w:tcW w:w="2410" w:type="dxa"/>
+            <w:vAlign w:val="center"/>
           </w:tcPr>
           <w:p>
             <w:pPr>
@@ -4090,11 +4339,13 @@
                 <w:szCs w:val="21"/>
               </w:rPr>
             </w:pPr>
-          </w:p>
-        </w:tc>
-        <w:tc>
-          <w:tcPr>
-            <w:tcW w:w="3402" w:type="dxa"/>
+            <w:bookmarkStart w:id="181" w:name="TestResult_7"/>
+            <w:bookmarkEnd w:id="181"/>
+          </w:p>
+        </w:tc>
+        <w:tc>
+          <w:tcPr>
+            <w:tcW w:w="1843" w:type="dxa"/>
           </w:tcPr>
           <w:p>
             <w:pPr>
@@ -4105,8 +4356,43 @@
                 <w:szCs w:val="21"/>
               </w:rPr>
             </w:pPr>
-            <w:bookmarkStart w:id="169" w:name="Recommendation_7"/>
-            <w:bookmarkEnd w:id="169"/>
+          </w:p>
+        </w:tc>
+        <w:tc>
+          <w:tcPr>
+            <w:tcW w:w="992" w:type="dxa"/>
+            <w:vAlign w:val="center"/>
+          </w:tcPr>
+          <w:p>
+            <w:pPr>
+              <w:pStyle w:val="aa"/>
+              <w:jc w:val="right"/>
+              <w:rPr>
+                <w:noProof/>
+                <w:sz w:val="21"/>
+                <w:szCs w:val="21"/>
+              </w:rPr>
+            </w:pPr>
+            <w:bookmarkStart w:id="182" w:name="Recommendationper_7"/>
+            <w:bookmarkEnd w:id="182"/>
+          </w:p>
+        </w:tc>
+        <w:tc>
+          <w:tcPr>
+            <w:tcW w:w="2551" w:type="dxa"/>
+            <w:vAlign w:val="center"/>
+          </w:tcPr>
+          <w:p>
+            <w:pPr>
+              <w:pStyle w:val="aa"/>
+              <w:rPr>
+                <w:noProof/>
+                <w:sz w:val="21"/>
+                <w:szCs w:val="21"/>
+              </w:rPr>
+            </w:pPr>
+            <w:bookmarkStart w:id="183" w:name="Recommendation_7"/>
+            <w:bookmarkEnd w:id="183"/>
           </w:p>
         </w:tc>
       </w:tr>
@@ -4133,24 +4419,27 @@
         </w:tc>
         <w:tc>
           <w:tcPr>
-            <w:tcW w:w="3402" w:type="dxa"/>
+            <w:tcW w:w="992" w:type="dxa"/>
+            <w:vAlign w:val="center"/>
           </w:tcPr>
           <w:p>
             <w:pPr>
               <w:pStyle w:val="aa"/>
+              <w:jc w:val="right"/>
               <w:rPr>
                 <w:noProof/>
                 <w:sz w:val="21"/>
                 <w:szCs w:val="21"/>
               </w:rPr>
             </w:pPr>
-            <w:bookmarkStart w:id="170" w:name="TestResult_8"/>
-            <w:bookmarkEnd w:id="170"/>
-          </w:p>
-        </w:tc>
-        <w:tc>
-          <w:tcPr>
-            <w:tcW w:w="1843" w:type="dxa"/>
+            <w:bookmarkStart w:id="184" w:name="TestResultper_8"/>
+            <w:bookmarkEnd w:id="184"/>
+          </w:p>
+        </w:tc>
+        <w:tc>
+          <w:tcPr>
+            <w:tcW w:w="2410" w:type="dxa"/>
+            <w:vAlign w:val="center"/>
           </w:tcPr>
           <w:p>
             <w:pPr>
@@ -4161,11 +4450,13 @@
                 <w:szCs w:val="21"/>
               </w:rPr>
             </w:pPr>
-          </w:p>
-        </w:tc>
-        <w:tc>
-          <w:tcPr>
-            <w:tcW w:w="3402" w:type="dxa"/>
+            <w:bookmarkStart w:id="185" w:name="TestResult_8"/>
+            <w:bookmarkEnd w:id="185"/>
+          </w:p>
+        </w:tc>
+        <w:tc>
+          <w:tcPr>
+            <w:tcW w:w="1843" w:type="dxa"/>
           </w:tcPr>
           <w:p>
             <w:pPr>
@@ -4176,8 +4467,43 @@
                 <w:szCs w:val="21"/>
               </w:rPr>
             </w:pPr>
-            <w:bookmarkStart w:id="171" w:name="Recommendation_8"/>
-            <w:bookmarkEnd w:id="171"/>
+          </w:p>
+        </w:tc>
+        <w:tc>
+          <w:tcPr>
+            <w:tcW w:w="992" w:type="dxa"/>
+            <w:vAlign w:val="center"/>
+          </w:tcPr>
+          <w:p>
+            <w:pPr>
+              <w:pStyle w:val="aa"/>
+              <w:jc w:val="right"/>
+              <w:rPr>
+                <w:noProof/>
+                <w:sz w:val="21"/>
+                <w:szCs w:val="21"/>
+              </w:rPr>
+            </w:pPr>
+            <w:bookmarkStart w:id="186" w:name="Recommendationper_8"/>
+            <w:bookmarkEnd w:id="186"/>
+          </w:p>
+        </w:tc>
+        <w:tc>
+          <w:tcPr>
+            <w:tcW w:w="2551" w:type="dxa"/>
+            <w:vAlign w:val="center"/>
+          </w:tcPr>
+          <w:p>
+            <w:pPr>
+              <w:pStyle w:val="aa"/>
+              <w:rPr>
+                <w:noProof/>
+                <w:sz w:val="21"/>
+                <w:szCs w:val="21"/>
+              </w:rPr>
+            </w:pPr>
+            <w:bookmarkStart w:id="187" w:name="Recommendation_8"/>
+            <w:bookmarkEnd w:id="187"/>
           </w:p>
         </w:tc>
       </w:tr>
@@ -4204,24 +4530,27 @@
         </w:tc>
         <w:tc>
           <w:tcPr>
-            <w:tcW w:w="3402" w:type="dxa"/>
+            <w:tcW w:w="992" w:type="dxa"/>
+            <w:vAlign w:val="center"/>
           </w:tcPr>
           <w:p>
             <w:pPr>
               <w:pStyle w:val="aa"/>
+              <w:jc w:val="right"/>
               <w:rPr>
                 <w:noProof/>
                 <w:sz w:val="21"/>
                 <w:szCs w:val="21"/>
               </w:rPr>
             </w:pPr>
-            <w:bookmarkStart w:id="172" w:name="TestResult_9"/>
-            <w:bookmarkEnd w:id="172"/>
-          </w:p>
-        </w:tc>
-        <w:tc>
-          <w:tcPr>
-            <w:tcW w:w="1843" w:type="dxa"/>
+            <w:bookmarkStart w:id="188" w:name="TestResultper_9"/>
+            <w:bookmarkEnd w:id="188"/>
+          </w:p>
+        </w:tc>
+        <w:tc>
+          <w:tcPr>
+            <w:tcW w:w="2410" w:type="dxa"/>
+            <w:vAlign w:val="center"/>
           </w:tcPr>
           <w:p>
             <w:pPr>
@@ -4232,11 +4561,13 @@
                 <w:szCs w:val="21"/>
               </w:rPr>
             </w:pPr>
-          </w:p>
-        </w:tc>
-        <w:tc>
-          <w:tcPr>
-            <w:tcW w:w="3402" w:type="dxa"/>
+            <w:bookmarkStart w:id="189" w:name="TestResult_9"/>
+            <w:bookmarkEnd w:id="189"/>
+          </w:p>
+        </w:tc>
+        <w:tc>
+          <w:tcPr>
+            <w:tcW w:w="1843" w:type="dxa"/>
           </w:tcPr>
           <w:p>
             <w:pPr>
@@ -4247,8 +4578,43 @@
                 <w:szCs w:val="21"/>
               </w:rPr>
             </w:pPr>
-            <w:bookmarkStart w:id="173" w:name="Recommendation_9"/>
-            <w:bookmarkEnd w:id="173"/>
+          </w:p>
+        </w:tc>
+        <w:tc>
+          <w:tcPr>
+            <w:tcW w:w="992" w:type="dxa"/>
+            <w:vAlign w:val="center"/>
+          </w:tcPr>
+          <w:p>
+            <w:pPr>
+              <w:pStyle w:val="aa"/>
+              <w:jc w:val="right"/>
+              <w:rPr>
+                <w:noProof/>
+                <w:sz w:val="21"/>
+                <w:szCs w:val="21"/>
+              </w:rPr>
+            </w:pPr>
+            <w:bookmarkStart w:id="190" w:name="Recommendationper_9"/>
+            <w:bookmarkEnd w:id="190"/>
+          </w:p>
+        </w:tc>
+        <w:tc>
+          <w:tcPr>
+            <w:tcW w:w="2551" w:type="dxa"/>
+            <w:vAlign w:val="center"/>
+          </w:tcPr>
+          <w:p>
+            <w:pPr>
+              <w:pStyle w:val="aa"/>
+              <w:rPr>
+                <w:noProof/>
+                <w:sz w:val="21"/>
+                <w:szCs w:val="21"/>
+              </w:rPr>
+            </w:pPr>
+            <w:bookmarkStart w:id="191" w:name="Recommendation_9"/>
+            <w:bookmarkEnd w:id="191"/>
           </w:p>
         </w:tc>
       </w:tr>
@@ -4275,24 +4641,27 @@
         </w:tc>
         <w:tc>
           <w:tcPr>
-            <w:tcW w:w="3402" w:type="dxa"/>
+            <w:tcW w:w="992" w:type="dxa"/>
+            <w:vAlign w:val="center"/>
           </w:tcPr>
           <w:p>
             <w:pPr>
               <w:pStyle w:val="aa"/>
+              <w:jc w:val="right"/>
               <w:rPr>
                 <w:noProof/>
                 <w:sz w:val="21"/>
                 <w:szCs w:val="21"/>
               </w:rPr>
             </w:pPr>
-            <w:bookmarkStart w:id="174" w:name="TestResult_10"/>
-            <w:bookmarkEnd w:id="174"/>
-          </w:p>
-        </w:tc>
-        <w:tc>
-          <w:tcPr>
-            <w:tcW w:w="1843" w:type="dxa"/>
+            <w:bookmarkStart w:id="192" w:name="TestResultper_10"/>
+            <w:bookmarkEnd w:id="192"/>
+          </w:p>
+        </w:tc>
+        <w:tc>
+          <w:tcPr>
+            <w:tcW w:w="2410" w:type="dxa"/>
+            <w:vAlign w:val="center"/>
           </w:tcPr>
           <w:p>
             <w:pPr>
@@ -4303,11 +4672,13 @@
                 <w:szCs w:val="21"/>
               </w:rPr>
             </w:pPr>
-          </w:p>
-        </w:tc>
-        <w:tc>
-          <w:tcPr>
-            <w:tcW w:w="3402" w:type="dxa"/>
+            <w:bookmarkStart w:id="193" w:name="TestResult_10"/>
+            <w:bookmarkEnd w:id="193"/>
+          </w:p>
+        </w:tc>
+        <w:tc>
+          <w:tcPr>
+            <w:tcW w:w="1843" w:type="dxa"/>
           </w:tcPr>
           <w:p>
             <w:pPr>
@@ -4318,8 +4689,43 @@
                 <w:szCs w:val="21"/>
               </w:rPr>
             </w:pPr>
-            <w:bookmarkStart w:id="175" w:name="Recommendation_10"/>
-            <w:bookmarkEnd w:id="175"/>
+          </w:p>
+        </w:tc>
+        <w:tc>
+          <w:tcPr>
+            <w:tcW w:w="992" w:type="dxa"/>
+            <w:vAlign w:val="center"/>
+          </w:tcPr>
+          <w:p>
+            <w:pPr>
+              <w:pStyle w:val="aa"/>
+              <w:jc w:val="right"/>
+              <w:rPr>
+                <w:noProof/>
+                <w:sz w:val="21"/>
+                <w:szCs w:val="21"/>
+              </w:rPr>
+            </w:pPr>
+            <w:bookmarkStart w:id="194" w:name="Recommendationper_10"/>
+            <w:bookmarkEnd w:id="194"/>
+          </w:p>
+        </w:tc>
+        <w:tc>
+          <w:tcPr>
+            <w:tcW w:w="2551" w:type="dxa"/>
+            <w:vAlign w:val="center"/>
+          </w:tcPr>
+          <w:p>
+            <w:pPr>
+              <w:pStyle w:val="aa"/>
+              <w:rPr>
+                <w:noProof/>
+                <w:sz w:val="21"/>
+                <w:szCs w:val="21"/>
+              </w:rPr>
+            </w:pPr>
+            <w:bookmarkStart w:id="195" w:name="Recommendation_10"/>
+            <w:bookmarkEnd w:id="195"/>
           </w:p>
         </w:tc>
       </w:tr>
@@ -4377,8 +4783,8 @@
               </w:rPr>
               <w:t>Conclusion:</w:t>
             </w:r>
-            <w:bookmarkStart w:id="176" w:name="Conclusion"/>
-            <w:bookmarkEnd w:id="176"/>
+            <w:bookmarkStart w:id="196" w:name="Conclusion"/>
+            <w:bookmarkEnd w:id="196"/>
           </w:p>
         </w:tc>
         <w:tc>
@@ -4394,8 +4800,8 @@
                 <w:szCs w:val="18"/>
               </w:rPr>
             </w:pPr>
-            <w:bookmarkStart w:id="177" w:name="VertifyResult"/>
-            <w:bookmarkEnd w:id="177"/>
+            <w:bookmarkStart w:id="197" w:name="VertifyResult"/>
+            <w:bookmarkEnd w:id="197"/>
           </w:p>
         </w:tc>
       </w:tr>
@@ -4453,8 +4859,8 @@
               </w:rPr>
               <w:t>Remark:</w:t>
             </w:r>
-            <w:bookmarkStart w:id="178" w:name="Remark"/>
-            <w:bookmarkEnd w:id="178"/>
+            <w:bookmarkStart w:id="198" w:name="Remark"/>
+            <w:bookmarkEnd w:id="198"/>
           </w:p>
         </w:tc>
         <w:tc>
@@ -4470,8 +4876,8 @@
                 <w:szCs w:val="18"/>
               </w:rPr>
             </w:pPr>
-            <w:bookmarkStart w:id="179" w:name="ResultRemark"/>
-            <w:bookmarkEnd w:id="179"/>
+            <w:bookmarkStart w:id="199" w:name="ResultRemark"/>
+            <w:bookmarkEnd w:id="199"/>
           </w:p>
         </w:tc>
         <w:tc>
@@ -4487,8 +4893,8 @@
                 <w:szCs w:val="18"/>
               </w:rPr>
             </w:pPr>
-            <w:bookmarkStart w:id="180" w:name="LabelRemark"/>
-            <w:bookmarkEnd w:id="180"/>
+            <w:bookmarkStart w:id="200" w:name="LabelRemark"/>
+            <w:bookmarkEnd w:id="200"/>
           </w:p>
         </w:tc>
       </w:tr>
@@ -4524,8 +4930,8 @@
                 <w:szCs w:val="18"/>
               </w:rPr>
             </w:pPr>
-            <w:bookmarkStart w:id="181" w:name="JudgmentLabelRemark"/>
-            <w:bookmarkEnd w:id="181"/>
+            <w:bookmarkStart w:id="201" w:name="JudgmentLabelRemark"/>
+            <w:bookmarkEnd w:id="201"/>
           </w:p>
         </w:tc>
       </w:tr>
@@ -4561,8 +4967,8 @@
                 <w:szCs w:val="18"/>
               </w:rPr>
             </w:pPr>
-            <w:bookmarkStart w:id="182" w:name="LanguageLabelRemark"/>
-            <w:bookmarkEnd w:id="182"/>
+            <w:bookmarkStart w:id="202" w:name="LanguageLabelRemark"/>
+            <w:bookmarkEnd w:id="202"/>
           </w:p>
         </w:tc>
       </w:tr>
@@ -5010,8 +5416,8 @@
                 <w:szCs w:val="16"/>
               </w:rPr>
             </w:pPr>
-            <w:bookmarkStart w:id="183" w:name="Description1"/>
-            <w:bookmarkEnd w:id="183"/>
+            <w:bookmarkStart w:id="203" w:name="Description1"/>
+            <w:bookmarkEnd w:id="203"/>
           </w:p>
         </w:tc>
         <w:tc>
@@ -5027,8 +5433,8 @@
                 <w:szCs w:val="18"/>
               </w:rPr>
             </w:pPr>
-            <w:bookmarkStart w:id="184" w:name="Component1"/>
-            <w:bookmarkEnd w:id="184"/>
+            <w:bookmarkStart w:id="204" w:name="Component1"/>
+            <w:bookmarkEnd w:id="204"/>
           </w:p>
         </w:tc>
         <w:tc>
@@ -5045,8 +5451,8 @@
                 <w:szCs w:val="13"/>
               </w:rPr>
             </w:pPr>
-            <w:bookmarkStart w:id="185" w:name="WeighingA1"/>
-            <w:bookmarkEnd w:id="185"/>
+            <w:bookmarkStart w:id="205" w:name="WeighingA1"/>
+            <w:bookmarkEnd w:id="205"/>
           </w:p>
         </w:tc>
         <w:tc>
@@ -5063,8 +5469,8 @@
                 <w:szCs w:val="13"/>
               </w:rPr>
             </w:pPr>
-            <w:bookmarkStart w:id="186" w:name="TotalA1"/>
-            <w:bookmarkEnd w:id="186"/>
+            <w:bookmarkStart w:id="206" w:name="TotalA1"/>
+            <w:bookmarkEnd w:id="206"/>
           </w:p>
         </w:tc>
         <w:tc>
@@ -5081,8 +5487,8 @@
                 <w:szCs w:val="13"/>
               </w:rPr>
             </w:pPr>
-            <w:bookmarkStart w:id="187" w:name="sampleA1"/>
-            <w:bookmarkEnd w:id="187"/>
+            <w:bookmarkStart w:id="207" w:name="sampleA1"/>
+            <w:bookmarkEnd w:id="207"/>
           </w:p>
         </w:tc>
         <w:tc>
@@ -5099,8 +5505,8 @@
                 <w:szCs w:val="13"/>
               </w:rPr>
             </w:pPr>
-            <w:bookmarkStart w:id="188" w:name="WeighingB1"/>
-            <w:bookmarkEnd w:id="188"/>
+            <w:bookmarkStart w:id="208" w:name="WeighingB1"/>
+            <w:bookmarkEnd w:id="208"/>
           </w:p>
         </w:tc>
         <w:tc>
@@ -5117,8 +5523,8 @@
                 <w:szCs w:val="13"/>
               </w:rPr>
             </w:pPr>
-            <w:bookmarkStart w:id="189" w:name="TotalB1"/>
-            <w:bookmarkEnd w:id="189"/>
+            <w:bookmarkStart w:id="209" w:name="TotalB1"/>
+            <w:bookmarkEnd w:id="209"/>
           </w:p>
         </w:tc>
         <w:tc>
@@ -5135,8 +5541,8 @@
                 <w:szCs w:val="13"/>
               </w:rPr>
             </w:pPr>
-            <w:bookmarkStart w:id="190" w:name="sampleB1"/>
-            <w:bookmarkEnd w:id="190"/>
+            <w:bookmarkStart w:id="210" w:name="sampleB1"/>
+            <w:bookmarkEnd w:id="210"/>
           </w:p>
         </w:tc>
       </w:tr>
@@ -5159,8 +5565,8 @@
                 <w:szCs w:val="16"/>
               </w:rPr>
             </w:pPr>
-            <w:bookmarkStart w:id="191" w:name="Description2"/>
-            <w:bookmarkEnd w:id="191"/>
+            <w:bookmarkStart w:id="211" w:name="Description2"/>
+            <w:bookmarkEnd w:id="211"/>
           </w:p>
         </w:tc>
         <w:tc>
@@ -5176,8 +5582,8 @@
                 <w:szCs w:val="18"/>
               </w:rPr>
             </w:pPr>
-            <w:bookmarkStart w:id="192" w:name="Component2"/>
-            <w:bookmarkEnd w:id="192"/>
+            <w:bookmarkStart w:id="212" w:name="Component2"/>
+            <w:bookmarkEnd w:id="212"/>
           </w:p>
         </w:tc>
         <w:tc>
@@ -5194,8 +5600,8 @@
                 <w:szCs w:val="13"/>
               </w:rPr>
             </w:pPr>
-            <w:bookmarkStart w:id="193" w:name="WeighingA2"/>
-            <w:bookmarkEnd w:id="193"/>
+            <w:bookmarkStart w:id="213" w:name="WeighingA2"/>
+            <w:bookmarkEnd w:id="213"/>
           </w:p>
         </w:tc>
         <w:tc>
@@ -5212,8 +5618,8 @@
                 <w:szCs w:val="13"/>
               </w:rPr>
             </w:pPr>
-            <w:bookmarkStart w:id="194" w:name="TotalA2"/>
-            <w:bookmarkEnd w:id="194"/>
+            <w:bookmarkStart w:id="214" w:name="TotalA2"/>
+            <w:bookmarkEnd w:id="214"/>
           </w:p>
         </w:tc>
         <w:tc>
@@ -5230,8 +5636,8 @@
                 <w:szCs w:val="13"/>
               </w:rPr>
             </w:pPr>
-            <w:bookmarkStart w:id="195" w:name="sampleA2"/>
-            <w:bookmarkEnd w:id="195"/>
+            <w:bookmarkStart w:id="215" w:name="sampleA2"/>
+            <w:bookmarkEnd w:id="215"/>
           </w:p>
         </w:tc>
         <w:tc>
@@ -5248,8 +5654,8 @@
                 <w:szCs w:val="13"/>
               </w:rPr>
             </w:pPr>
-            <w:bookmarkStart w:id="196" w:name="WeighingB2"/>
-            <w:bookmarkEnd w:id="196"/>
+            <w:bookmarkStart w:id="216" w:name="WeighingB2"/>
+            <w:bookmarkEnd w:id="216"/>
           </w:p>
         </w:tc>
         <w:tc>
@@ -5266,8 +5672,8 @@
                 <w:szCs w:val="13"/>
               </w:rPr>
             </w:pPr>
-            <w:bookmarkStart w:id="197" w:name="TotalB2"/>
-            <w:bookmarkEnd w:id="197"/>
+            <w:bookmarkStart w:id="217" w:name="TotalB2"/>
+            <w:bookmarkEnd w:id="217"/>
           </w:p>
         </w:tc>
         <w:tc>
@@ -5284,8 +5690,8 @@
                 <w:szCs w:val="13"/>
               </w:rPr>
             </w:pPr>
-            <w:bookmarkStart w:id="198" w:name="sampleB2"/>
-            <w:bookmarkEnd w:id="198"/>
+            <w:bookmarkStart w:id="218" w:name="sampleB2"/>
+            <w:bookmarkEnd w:id="218"/>
           </w:p>
         </w:tc>
       </w:tr>
@@ -5308,8 +5714,8 @@
                 <w:szCs w:val="16"/>
               </w:rPr>
             </w:pPr>
-            <w:bookmarkStart w:id="199" w:name="Description3"/>
-            <w:bookmarkEnd w:id="199"/>
+            <w:bookmarkStart w:id="219" w:name="Description3"/>
+            <w:bookmarkEnd w:id="219"/>
           </w:p>
         </w:tc>
         <w:tc>
@@ -5325,8 +5731,8 @@
                 <w:szCs w:val="18"/>
               </w:rPr>
             </w:pPr>
-            <w:bookmarkStart w:id="200" w:name="Component3"/>
-            <w:bookmarkEnd w:id="200"/>
+            <w:bookmarkStart w:id="220" w:name="Component3"/>
+            <w:bookmarkEnd w:id="220"/>
           </w:p>
         </w:tc>
         <w:tc>
@@ -5343,8 +5749,8 @@
                 <w:szCs w:val="13"/>
               </w:rPr>
             </w:pPr>
-            <w:bookmarkStart w:id="201" w:name="WeighingA3"/>
-            <w:bookmarkEnd w:id="201"/>
+            <w:bookmarkStart w:id="221" w:name="WeighingA3"/>
+            <w:bookmarkEnd w:id="221"/>
           </w:p>
         </w:tc>
         <w:tc>
@@ -5361,8 +5767,8 @@
                 <w:szCs w:val="13"/>
               </w:rPr>
             </w:pPr>
-            <w:bookmarkStart w:id="202" w:name="TotalA3"/>
-            <w:bookmarkEnd w:id="202"/>
+            <w:bookmarkStart w:id="222" w:name="TotalA3"/>
+            <w:bookmarkEnd w:id="222"/>
           </w:p>
         </w:tc>
         <w:tc>
@@ -5379,8 +5785,8 @@
                 <w:szCs w:val="13"/>
               </w:rPr>
             </w:pPr>
-            <w:bookmarkStart w:id="203" w:name="sampleA3"/>
-            <w:bookmarkEnd w:id="203"/>
+            <w:bookmarkStart w:id="223" w:name="sampleA3"/>
+            <w:bookmarkEnd w:id="223"/>
           </w:p>
         </w:tc>
         <w:tc>
@@ -5397,8 +5803,8 @@
                 <w:szCs w:val="13"/>
               </w:rPr>
             </w:pPr>
-            <w:bookmarkStart w:id="204" w:name="WeighingB3"/>
-            <w:bookmarkEnd w:id="204"/>
+            <w:bookmarkStart w:id="224" w:name="WeighingB3"/>
+            <w:bookmarkEnd w:id="224"/>
           </w:p>
         </w:tc>
         <w:tc>
@@ -5417,8 +5823,8 @@
                 <w:szCs w:val="13"/>
               </w:rPr>
             </w:pPr>
-            <w:bookmarkStart w:id="205" w:name="TotalB3"/>
-            <w:bookmarkEnd w:id="205"/>
+            <w:bookmarkStart w:id="225" w:name="TotalB3"/>
+            <w:bookmarkEnd w:id="225"/>
           </w:p>
         </w:tc>
         <w:tc>
@@ -5434,8 +5840,8 @@
                 <w:szCs w:val="13"/>
               </w:rPr>
             </w:pPr>
-            <w:bookmarkStart w:id="206" w:name="sampleB3"/>
-            <w:bookmarkEnd w:id="206"/>
+            <w:bookmarkStart w:id="226" w:name="sampleB3"/>
+            <w:bookmarkEnd w:id="226"/>
           </w:p>
         </w:tc>
       </w:tr>
@@ -5458,8 +5864,8 @@
                 <w:szCs w:val="16"/>
               </w:rPr>
             </w:pPr>
-            <w:bookmarkStart w:id="207" w:name="Description4"/>
-            <w:bookmarkEnd w:id="207"/>
+            <w:bookmarkStart w:id="227" w:name="Description4"/>
+            <w:bookmarkEnd w:id="227"/>
           </w:p>
         </w:tc>
         <w:tc>
@@ -5475,8 +5881,8 @@
                 <w:szCs w:val="18"/>
               </w:rPr>
             </w:pPr>
-            <w:bookmarkStart w:id="208" w:name="Component4"/>
-            <w:bookmarkEnd w:id="208"/>
+            <w:bookmarkStart w:id="228" w:name="Component4"/>
+            <w:bookmarkEnd w:id="228"/>
           </w:p>
         </w:tc>
         <w:tc>
@@ -5493,8 +5899,8 @@
                 <w:szCs w:val="13"/>
               </w:rPr>
             </w:pPr>
-            <w:bookmarkStart w:id="209" w:name="WeighingA4"/>
-            <w:bookmarkEnd w:id="209"/>
+            <w:bookmarkStart w:id="229" w:name="WeighingA4"/>
+            <w:bookmarkEnd w:id="229"/>
           </w:p>
         </w:tc>
         <w:tc>
@@ -5511,8 +5917,8 @@
                 <w:szCs w:val="13"/>
               </w:rPr>
             </w:pPr>
-            <w:bookmarkStart w:id="210" w:name="TotalA4"/>
-            <w:bookmarkEnd w:id="210"/>
+            <w:bookmarkStart w:id="230" w:name="TotalA4"/>
+            <w:bookmarkEnd w:id="230"/>
           </w:p>
         </w:tc>
         <w:tc>
@@ -5529,8 +5935,8 @@
                 <w:szCs w:val="13"/>
               </w:rPr>
             </w:pPr>
-            <w:bookmarkStart w:id="211" w:name="sampleA4"/>
-            <w:bookmarkEnd w:id="211"/>
+            <w:bookmarkStart w:id="231" w:name="sampleA4"/>
+            <w:bookmarkEnd w:id="231"/>
           </w:p>
         </w:tc>
         <w:tc>
@@ -5547,8 +5953,8 @@
                 <w:szCs w:val="13"/>
               </w:rPr>
             </w:pPr>
-            <w:bookmarkStart w:id="212" w:name="WeighingB4"/>
-            <w:bookmarkEnd w:id="212"/>
+            <w:bookmarkStart w:id="232" w:name="WeighingB4"/>
+            <w:bookmarkEnd w:id="232"/>
           </w:p>
         </w:tc>
         <w:tc>
@@ -5565,8 +5971,8 @@
                 <w:szCs w:val="13"/>
               </w:rPr>
             </w:pPr>
-            <w:bookmarkStart w:id="213" w:name="TotalB4"/>
-            <w:bookmarkEnd w:id="213"/>
+            <w:bookmarkStart w:id="233" w:name="TotalB4"/>
+            <w:bookmarkEnd w:id="233"/>
           </w:p>
         </w:tc>
         <w:tc>
@@ -5583,8 +5989,8 @@
                 <w:szCs w:val="13"/>
               </w:rPr>
             </w:pPr>
-            <w:bookmarkStart w:id="214" w:name="sampleB4"/>
-            <w:bookmarkEnd w:id="214"/>
+            <w:bookmarkStart w:id="234" w:name="sampleB4"/>
+            <w:bookmarkEnd w:id="234"/>
           </w:p>
         </w:tc>
       </w:tr>
@@ -5607,8 +6013,8 @@
                 <w:szCs w:val="16"/>
               </w:rPr>
             </w:pPr>
-            <w:bookmarkStart w:id="215" w:name="Description5"/>
-            <w:bookmarkEnd w:id="215"/>
+            <w:bookmarkStart w:id="235" w:name="Description5"/>
+            <w:bookmarkEnd w:id="235"/>
           </w:p>
         </w:tc>
         <w:tc>
@@ -5624,8 +6030,8 @@
                 <w:szCs w:val="18"/>
               </w:rPr>
             </w:pPr>
-            <w:bookmarkStart w:id="216" w:name="Component5"/>
-            <w:bookmarkEnd w:id="216"/>
+            <w:bookmarkStart w:id="236" w:name="Component5"/>
+            <w:bookmarkEnd w:id="236"/>
           </w:p>
         </w:tc>
         <w:tc>
@@ -5642,8 +6048,8 @@
                 <w:szCs w:val="13"/>
               </w:rPr>
             </w:pPr>
-            <w:bookmarkStart w:id="217" w:name="WeighingA5"/>
-            <w:bookmarkEnd w:id="217"/>
+            <w:bookmarkStart w:id="237" w:name="WeighingA5"/>
+            <w:bookmarkEnd w:id="237"/>
           </w:p>
         </w:tc>
         <w:tc>
@@ -5660,8 +6066,8 @@
                 <w:szCs w:val="13"/>
               </w:rPr>
             </w:pPr>
-            <w:bookmarkStart w:id="218" w:name="TotalA5"/>
-            <w:bookmarkEnd w:id="218"/>
+            <w:bookmarkStart w:id="238" w:name="TotalA5"/>
+            <w:bookmarkEnd w:id="238"/>
           </w:p>
         </w:tc>
         <w:tc>
@@ -5678,8 +6084,8 @@
                 <w:szCs w:val="13"/>
               </w:rPr>
             </w:pPr>
-            <w:bookmarkStart w:id="219" w:name="sampleA5"/>
-            <w:bookmarkEnd w:id="219"/>
+            <w:bookmarkStart w:id="239" w:name="sampleA5"/>
+            <w:bookmarkEnd w:id="239"/>
           </w:p>
         </w:tc>
         <w:tc>
@@ -5696,8 +6102,8 @@
                 <w:szCs w:val="13"/>
               </w:rPr>
             </w:pPr>
-            <w:bookmarkStart w:id="220" w:name="WeighingB5"/>
-            <w:bookmarkEnd w:id="220"/>
+            <w:bookmarkStart w:id="240" w:name="WeighingB5"/>
+            <w:bookmarkEnd w:id="240"/>
           </w:p>
         </w:tc>
         <w:tc>
@@ -5714,8 +6120,8 @@
                 <w:szCs w:val="13"/>
               </w:rPr>
             </w:pPr>
-            <w:bookmarkStart w:id="221" w:name="TotalB5"/>
-            <w:bookmarkEnd w:id="221"/>
+            <w:bookmarkStart w:id="241" w:name="TotalB5"/>
+            <w:bookmarkEnd w:id="241"/>
           </w:p>
         </w:tc>
         <w:tc>
@@ -5732,8 +6138,8 @@
                 <w:szCs w:val="13"/>
               </w:rPr>
             </w:pPr>
-            <w:bookmarkStart w:id="222" w:name="sampleB5"/>
-            <w:bookmarkEnd w:id="222"/>
+            <w:bookmarkStart w:id="242" w:name="sampleB5"/>
+            <w:bookmarkEnd w:id="242"/>
           </w:p>
         </w:tc>
       </w:tr>
@@ -5756,8 +6162,8 @@
                 <w:szCs w:val="16"/>
               </w:rPr>
             </w:pPr>
-            <w:bookmarkStart w:id="223" w:name="Description6"/>
-            <w:bookmarkEnd w:id="223"/>
+            <w:bookmarkStart w:id="243" w:name="Description6"/>
+            <w:bookmarkEnd w:id="243"/>
           </w:p>
         </w:tc>
         <w:tc>
@@ -5773,8 +6179,8 @@
                 <w:szCs w:val="18"/>
               </w:rPr>
             </w:pPr>
-            <w:bookmarkStart w:id="224" w:name="Component6"/>
-            <w:bookmarkEnd w:id="224"/>
+            <w:bookmarkStart w:id="244" w:name="Component6"/>
+            <w:bookmarkEnd w:id="244"/>
           </w:p>
         </w:tc>
         <w:tc>
@@ -5791,8 +6197,8 @@
                 <w:szCs w:val="13"/>
               </w:rPr>
             </w:pPr>
-            <w:bookmarkStart w:id="225" w:name="WeighingA6"/>
-            <w:bookmarkEnd w:id="225"/>
+            <w:bookmarkStart w:id="245" w:name="WeighingA6"/>
+            <w:bookmarkEnd w:id="245"/>
           </w:p>
         </w:tc>
         <w:tc>
@@ -5809,8 +6215,8 @@
                 <w:szCs w:val="13"/>
               </w:rPr>
             </w:pPr>
-            <w:bookmarkStart w:id="226" w:name="TotalA6"/>
-            <w:bookmarkEnd w:id="226"/>
+            <w:bookmarkStart w:id="246" w:name="TotalA6"/>
+            <w:bookmarkEnd w:id="246"/>
           </w:p>
         </w:tc>
         <w:tc>
@@ -5827,8 +6233,8 @@
                 <w:szCs w:val="13"/>
               </w:rPr>
             </w:pPr>
-            <w:bookmarkStart w:id="227" w:name="sampleA6"/>
-            <w:bookmarkEnd w:id="227"/>
+            <w:bookmarkStart w:id="247" w:name="sampleA6"/>
+            <w:bookmarkEnd w:id="247"/>
           </w:p>
         </w:tc>
         <w:tc>
@@ -5845,8 +6251,8 @@
                 <w:szCs w:val="13"/>
               </w:rPr>
             </w:pPr>
-            <w:bookmarkStart w:id="228" w:name="WeighingB6"/>
-            <w:bookmarkEnd w:id="228"/>
+            <w:bookmarkStart w:id="248" w:name="WeighingB6"/>
+            <w:bookmarkEnd w:id="248"/>
           </w:p>
         </w:tc>
         <w:tc>
@@ -5863,8 +6269,8 @@
                 <w:szCs w:val="13"/>
               </w:rPr>
             </w:pPr>
-            <w:bookmarkStart w:id="229" w:name="TotalB6"/>
-            <w:bookmarkEnd w:id="229"/>
+            <w:bookmarkStart w:id="249" w:name="TotalB6"/>
+            <w:bookmarkEnd w:id="249"/>
           </w:p>
         </w:tc>
         <w:tc>
@@ -5881,8 +6287,8 @@
                 <w:szCs w:val="13"/>
               </w:rPr>
             </w:pPr>
-            <w:bookmarkStart w:id="230" w:name="sampleB6"/>
-            <w:bookmarkEnd w:id="230"/>
+            <w:bookmarkStart w:id="250" w:name="sampleB6"/>
+            <w:bookmarkEnd w:id="250"/>
           </w:p>
         </w:tc>
       </w:tr>
@@ -5905,8 +6311,8 @@
                 <w:szCs w:val="16"/>
               </w:rPr>
             </w:pPr>
-            <w:bookmarkStart w:id="231" w:name="Description7"/>
-            <w:bookmarkEnd w:id="231"/>
+            <w:bookmarkStart w:id="251" w:name="Description7"/>
+            <w:bookmarkEnd w:id="251"/>
           </w:p>
         </w:tc>
         <w:tc>
@@ -5922,8 +6328,8 @@
                 <w:szCs w:val="18"/>
               </w:rPr>
             </w:pPr>
-            <w:bookmarkStart w:id="232" w:name="Component7"/>
-            <w:bookmarkEnd w:id="232"/>
+            <w:bookmarkStart w:id="252" w:name="Component7"/>
+            <w:bookmarkEnd w:id="252"/>
           </w:p>
         </w:tc>
         <w:tc>
@@ -5940,8 +6346,8 @@
                 <w:szCs w:val="13"/>
               </w:rPr>
             </w:pPr>
-            <w:bookmarkStart w:id="233" w:name="WeighingA7"/>
-            <w:bookmarkEnd w:id="233"/>
+            <w:bookmarkStart w:id="253" w:name="WeighingA7"/>
+            <w:bookmarkEnd w:id="253"/>
           </w:p>
         </w:tc>
         <w:tc>
@@ -5958,8 +6364,8 @@
                 <w:szCs w:val="13"/>
               </w:rPr>
             </w:pPr>
-            <w:bookmarkStart w:id="234" w:name="TotalA7"/>
-            <w:bookmarkEnd w:id="234"/>
+            <w:bookmarkStart w:id="254" w:name="TotalA7"/>
+            <w:bookmarkEnd w:id="254"/>
           </w:p>
         </w:tc>
         <w:tc>
@@ -5976,8 +6382,8 @@
                 <w:szCs w:val="13"/>
               </w:rPr>
             </w:pPr>
-            <w:bookmarkStart w:id="235" w:name="sampleA7"/>
-            <w:bookmarkEnd w:id="235"/>
+            <w:bookmarkStart w:id="255" w:name="sampleA7"/>
+            <w:bookmarkEnd w:id="255"/>
           </w:p>
         </w:tc>
         <w:tc>
@@ -5994,8 +6400,8 @@
                 <w:szCs w:val="13"/>
               </w:rPr>
             </w:pPr>
-            <w:bookmarkStart w:id="236" w:name="WeighingB7"/>
-            <w:bookmarkEnd w:id="236"/>
+            <w:bookmarkStart w:id="256" w:name="WeighingB7"/>
+            <w:bookmarkEnd w:id="256"/>
           </w:p>
         </w:tc>
         <w:tc>
@@ -6012,8 +6418,8 @@
                 <w:szCs w:val="13"/>
               </w:rPr>
             </w:pPr>
-            <w:bookmarkStart w:id="237" w:name="TotalB7"/>
-            <w:bookmarkEnd w:id="237"/>
+            <w:bookmarkStart w:id="257" w:name="TotalB7"/>
+            <w:bookmarkEnd w:id="257"/>
           </w:p>
         </w:tc>
         <w:tc>
@@ -6030,8 +6436,8 @@
                 <w:szCs w:val="13"/>
               </w:rPr>
             </w:pPr>
-            <w:bookmarkStart w:id="238" w:name="sampleB7"/>
-            <w:bookmarkEnd w:id="238"/>
+            <w:bookmarkStart w:id="258" w:name="sampleB7"/>
+            <w:bookmarkEnd w:id="258"/>
           </w:p>
         </w:tc>
       </w:tr>
@@ -6054,8 +6460,8 @@
                 <w:szCs w:val="16"/>
               </w:rPr>
             </w:pPr>
-            <w:bookmarkStart w:id="239" w:name="Description8"/>
-            <w:bookmarkEnd w:id="239"/>
+            <w:bookmarkStart w:id="259" w:name="Description8"/>
+            <w:bookmarkEnd w:id="259"/>
           </w:p>
         </w:tc>
         <w:tc>
@@ -6071,8 +6477,8 @@
                 <w:szCs w:val="18"/>
               </w:rPr>
             </w:pPr>
-            <w:bookmarkStart w:id="240" w:name="Component8"/>
-            <w:bookmarkEnd w:id="240"/>
+            <w:bookmarkStart w:id="260" w:name="Component8"/>
+            <w:bookmarkEnd w:id="260"/>
           </w:p>
         </w:tc>
         <w:tc>
@@ -6089,8 +6495,8 @@
                 <w:szCs w:val="13"/>
               </w:rPr>
             </w:pPr>
-            <w:bookmarkStart w:id="241" w:name="WeighingA8"/>
-            <w:bookmarkEnd w:id="241"/>
+            <w:bookmarkStart w:id="261" w:name="WeighingA8"/>
+            <w:bookmarkEnd w:id="261"/>
           </w:p>
         </w:tc>
         <w:tc>
@@ -6107,8 +6513,8 @@
                 <w:szCs w:val="13"/>
               </w:rPr>
             </w:pPr>
-            <w:bookmarkStart w:id="242" w:name="TotalA8"/>
-            <w:bookmarkEnd w:id="242"/>
+            <w:bookmarkStart w:id="262" w:name="TotalA8"/>
+            <w:bookmarkEnd w:id="262"/>
           </w:p>
         </w:tc>
         <w:tc>
@@ -6125,8 +6531,8 @@
                 <w:szCs w:val="13"/>
               </w:rPr>
             </w:pPr>
-            <w:bookmarkStart w:id="243" w:name="sampleA8"/>
-            <w:bookmarkEnd w:id="243"/>
+            <w:bookmarkStart w:id="263" w:name="sampleA8"/>
+            <w:bookmarkEnd w:id="263"/>
           </w:p>
         </w:tc>
         <w:tc>
@@ -6143,8 +6549,8 @@
                 <w:szCs w:val="13"/>
               </w:rPr>
             </w:pPr>
-            <w:bookmarkStart w:id="244" w:name="WeighingB8"/>
-            <w:bookmarkEnd w:id="244"/>
+            <w:bookmarkStart w:id="264" w:name="WeighingB8"/>
+            <w:bookmarkEnd w:id="264"/>
           </w:p>
         </w:tc>
         <w:tc>
@@ -6161,8 +6567,8 @@
                 <w:szCs w:val="13"/>
               </w:rPr>
             </w:pPr>
-            <w:bookmarkStart w:id="245" w:name="TotalB8"/>
-            <w:bookmarkEnd w:id="245"/>
+            <w:bookmarkStart w:id="265" w:name="TotalB8"/>
+            <w:bookmarkEnd w:id="265"/>
           </w:p>
         </w:tc>
         <w:tc>
@@ -6179,8 +6585,8 @@
                 <w:szCs w:val="13"/>
               </w:rPr>
             </w:pPr>
-            <w:bookmarkStart w:id="246" w:name="sampleB8"/>
-            <w:bookmarkEnd w:id="246"/>
+            <w:bookmarkStart w:id="266" w:name="sampleB8"/>
+            <w:bookmarkEnd w:id="266"/>
           </w:p>
         </w:tc>
       </w:tr>
@@ -6203,8 +6609,8 @@
                 <w:szCs w:val="16"/>
               </w:rPr>
             </w:pPr>
-            <w:bookmarkStart w:id="247" w:name="Description9"/>
-            <w:bookmarkEnd w:id="247"/>
+            <w:bookmarkStart w:id="267" w:name="Description9"/>
+            <w:bookmarkEnd w:id="267"/>
           </w:p>
         </w:tc>
         <w:tc>
@@ -6220,8 +6626,8 @@
                 <w:szCs w:val="18"/>
               </w:rPr>
             </w:pPr>
-            <w:bookmarkStart w:id="248" w:name="Component9"/>
-            <w:bookmarkEnd w:id="248"/>
+            <w:bookmarkStart w:id="268" w:name="Component9"/>
+            <w:bookmarkEnd w:id="268"/>
           </w:p>
         </w:tc>
         <w:tc>
@@ -6238,8 +6644,8 @@
                 <w:szCs w:val="13"/>
               </w:rPr>
             </w:pPr>
-            <w:bookmarkStart w:id="249" w:name="WeighingA9"/>
-            <w:bookmarkEnd w:id="249"/>
+            <w:bookmarkStart w:id="269" w:name="WeighingA9"/>
+            <w:bookmarkEnd w:id="269"/>
           </w:p>
         </w:tc>
         <w:tc>
@@ -6256,8 +6662,8 @@
                 <w:szCs w:val="13"/>
               </w:rPr>
             </w:pPr>
-            <w:bookmarkStart w:id="250" w:name="TotalA9"/>
-            <w:bookmarkEnd w:id="250"/>
+            <w:bookmarkStart w:id="270" w:name="TotalA9"/>
+            <w:bookmarkEnd w:id="270"/>
           </w:p>
         </w:tc>
         <w:tc>
@@ -6274,8 +6680,8 @@
                 <w:szCs w:val="13"/>
               </w:rPr>
             </w:pPr>
-            <w:bookmarkStart w:id="251" w:name="sampleA9"/>
-            <w:bookmarkEnd w:id="251"/>
+            <w:bookmarkStart w:id="271" w:name="sampleA9"/>
+            <w:bookmarkEnd w:id="271"/>
           </w:p>
         </w:tc>
         <w:tc>
@@ -6292,8 +6698,8 @@
                 <w:szCs w:val="13"/>
               </w:rPr>
             </w:pPr>
-            <w:bookmarkStart w:id="252" w:name="WeighingB9"/>
-            <w:bookmarkEnd w:id="252"/>
+            <w:bookmarkStart w:id="272" w:name="WeighingB9"/>
+            <w:bookmarkEnd w:id="272"/>
           </w:p>
         </w:tc>
         <w:tc>
@@ -6310,8 +6716,8 @@
                 <w:szCs w:val="13"/>
               </w:rPr>
             </w:pPr>
-            <w:bookmarkStart w:id="253" w:name="TotalB9"/>
-            <w:bookmarkEnd w:id="253"/>
+            <w:bookmarkStart w:id="273" w:name="TotalB9"/>
+            <w:bookmarkEnd w:id="273"/>
           </w:p>
         </w:tc>
         <w:tc>
@@ -6328,8 +6734,8 @@
                 <w:szCs w:val="13"/>
               </w:rPr>
             </w:pPr>
-            <w:bookmarkStart w:id="254" w:name="sampleB9"/>
-            <w:bookmarkEnd w:id="254"/>
+            <w:bookmarkStart w:id="274" w:name="sampleB9"/>
+            <w:bookmarkEnd w:id="274"/>
           </w:p>
         </w:tc>
       </w:tr>
@@ -6352,8 +6758,8 @@
                 <w:szCs w:val="16"/>
               </w:rPr>
             </w:pPr>
-            <w:bookmarkStart w:id="255" w:name="Description10"/>
-            <w:bookmarkEnd w:id="255"/>
+            <w:bookmarkStart w:id="275" w:name="Description10"/>
+            <w:bookmarkEnd w:id="275"/>
           </w:p>
         </w:tc>
         <w:tc>
@@ -6369,8 +6775,8 @@
                 <w:szCs w:val="18"/>
               </w:rPr>
             </w:pPr>
-            <w:bookmarkStart w:id="256" w:name="Component10"/>
-            <w:bookmarkEnd w:id="256"/>
+            <w:bookmarkStart w:id="276" w:name="Component10"/>
+            <w:bookmarkEnd w:id="276"/>
           </w:p>
         </w:tc>
         <w:tc>
@@ -6387,8 +6793,8 @@
                 <w:szCs w:val="13"/>
               </w:rPr>
             </w:pPr>
-            <w:bookmarkStart w:id="257" w:name="WeighingA10"/>
-            <w:bookmarkEnd w:id="257"/>
+            <w:bookmarkStart w:id="277" w:name="WeighingA10"/>
+            <w:bookmarkEnd w:id="277"/>
           </w:p>
         </w:tc>
         <w:tc>
@@ -6405,8 +6811,8 @@
                 <w:szCs w:val="13"/>
               </w:rPr>
             </w:pPr>
-            <w:bookmarkStart w:id="258" w:name="TotalA10"/>
-            <w:bookmarkEnd w:id="258"/>
+            <w:bookmarkStart w:id="278" w:name="TotalA10"/>
+            <w:bookmarkEnd w:id="278"/>
           </w:p>
         </w:tc>
         <w:tc>
@@ -6423,8 +6829,8 @@
                 <w:szCs w:val="13"/>
               </w:rPr>
             </w:pPr>
-            <w:bookmarkStart w:id="259" w:name="sampleA10"/>
-            <w:bookmarkEnd w:id="259"/>
+            <w:bookmarkStart w:id="279" w:name="sampleA10"/>
+            <w:bookmarkEnd w:id="279"/>
           </w:p>
         </w:tc>
         <w:tc>
@@ -6441,8 +6847,8 @@
                 <w:szCs w:val="13"/>
               </w:rPr>
             </w:pPr>
-            <w:bookmarkStart w:id="260" w:name="WeighingB10"/>
-            <w:bookmarkEnd w:id="260"/>
+            <w:bookmarkStart w:id="280" w:name="WeighingB10"/>
+            <w:bookmarkEnd w:id="280"/>
           </w:p>
         </w:tc>
         <w:tc>
@@ -6459,8 +6865,8 @@
                 <w:szCs w:val="13"/>
               </w:rPr>
             </w:pPr>
-            <w:bookmarkStart w:id="261" w:name="TotalB10"/>
-            <w:bookmarkEnd w:id="261"/>
+            <w:bookmarkStart w:id="281" w:name="TotalB10"/>
+            <w:bookmarkEnd w:id="281"/>
           </w:p>
         </w:tc>
         <w:tc>
@@ -6477,8 +6883,8 @@
                 <w:szCs w:val="13"/>
               </w:rPr>
             </w:pPr>
-            <w:bookmarkStart w:id="262" w:name="sampleB10"/>
-            <w:bookmarkEnd w:id="262"/>
+            <w:bookmarkStart w:id="282" w:name="sampleB10"/>
+            <w:bookmarkEnd w:id="282"/>
           </w:p>
         </w:tc>
       </w:tr>
@@ -6501,8 +6907,8 @@
                 <w:szCs w:val="16"/>
               </w:rPr>
             </w:pPr>
-            <w:bookmarkStart w:id="263" w:name="Description11"/>
-            <w:bookmarkEnd w:id="263"/>
+            <w:bookmarkStart w:id="283" w:name="Description11"/>
+            <w:bookmarkEnd w:id="283"/>
           </w:p>
         </w:tc>
         <w:tc>
@@ -6518,8 +6924,8 @@
                 <w:szCs w:val="18"/>
               </w:rPr>
             </w:pPr>
-            <w:bookmarkStart w:id="264" w:name="Component11"/>
-            <w:bookmarkEnd w:id="264"/>
+            <w:bookmarkStart w:id="284" w:name="Component11"/>
+            <w:bookmarkEnd w:id="284"/>
           </w:p>
         </w:tc>
         <w:tc>
@@ -6536,8 +6942,8 @@
                 <w:szCs w:val="13"/>
               </w:rPr>
             </w:pPr>
-            <w:bookmarkStart w:id="265" w:name="WeighingA11"/>
-            <w:bookmarkEnd w:id="265"/>
+            <w:bookmarkStart w:id="285" w:name="WeighingA11"/>
+            <w:bookmarkEnd w:id="285"/>
           </w:p>
         </w:tc>
         <w:tc>
@@ -6554,8 +6960,8 @@
                 <w:szCs w:val="13"/>
               </w:rPr>
             </w:pPr>
-            <w:bookmarkStart w:id="266" w:name="TotalA11"/>
-            <w:bookmarkEnd w:id="266"/>
+            <w:bookmarkStart w:id="286" w:name="TotalA11"/>
+            <w:bookmarkEnd w:id="286"/>
           </w:p>
         </w:tc>
         <w:tc>
@@ -6572,8 +6978,8 @@
                 <w:szCs w:val="13"/>
               </w:rPr>
             </w:pPr>
-            <w:bookmarkStart w:id="267" w:name="sampleA11"/>
-            <w:bookmarkEnd w:id="267"/>
+            <w:bookmarkStart w:id="287" w:name="sampleA11"/>
+            <w:bookmarkEnd w:id="287"/>
           </w:p>
         </w:tc>
         <w:tc>
@@ -6590,8 +6996,8 @@
                 <w:szCs w:val="13"/>
               </w:rPr>
             </w:pPr>
-            <w:bookmarkStart w:id="268" w:name="WeighingB11"/>
-            <w:bookmarkEnd w:id="268"/>
+            <w:bookmarkStart w:id="288" w:name="WeighingB11"/>
+            <w:bookmarkEnd w:id="288"/>
           </w:p>
         </w:tc>
         <w:tc>
@@ -6608,8 +7014,8 @@
                 <w:szCs w:val="13"/>
               </w:rPr>
             </w:pPr>
-            <w:bookmarkStart w:id="269" w:name="TotalB11"/>
-            <w:bookmarkEnd w:id="269"/>
+            <w:bookmarkStart w:id="289" w:name="TotalB11"/>
+            <w:bookmarkEnd w:id="289"/>
           </w:p>
         </w:tc>
         <w:tc>
@@ -6626,8 +7032,8 @@
                 <w:szCs w:val="13"/>
               </w:rPr>
             </w:pPr>
-            <w:bookmarkStart w:id="270" w:name="sampleB11"/>
-            <w:bookmarkEnd w:id="270"/>
+            <w:bookmarkStart w:id="290" w:name="sampleB11"/>
+            <w:bookmarkEnd w:id="290"/>
           </w:p>
         </w:tc>
       </w:tr>
@@ -6650,8 +7056,8 @@
                 <w:szCs w:val="16"/>
               </w:rPr>
             </w:pPr>
-            <w:bookmarkStart w:id="271" w:name="Description12"/>
-            <w:bookmarkEnd w:id="271"/>
+            <w:bookmarkStart w:id="291" w:name="Description12"/>
+            <w:bookmarkEnd w:id="291"/>
           </w:p>
         </w:tc>
         <w:tc>
@@ -6667,8 +7073,8 @@
                 <w:szCs w:val="18"/>
               </w:rPr>
             </w:pPr>
-            <w:bookmarkStart w:id="272" w:name="Component12"/>
-            <w:bookmarkEnd w:id="272"/>
+            <w:bookmarkStart w:id="292" w:name="Component12"/>
+            <w:bookmarkEnd w:id="292"/>
           </w:p>
         </w:tc>
         <w:tc>
@@ -6685,8 +7091,8 @@
                 <w:szCs w:val="13"/>
               </w:rPr>
             </w:pPr>
-            <w:bookmarkStart w:id="273" w:name="WeighingA12"/>
-            <w:bookmarkEnd w:id="273"/>
+            <w:bookmarkStart w:id="293" w:name="WeighingA12"/>
+            <w:bookmarkEnd w:id="293"/>
           </w:p>
         </w:tc>
         <w:tc>
@@ -6703,8 +7109,8 @@
                 <w:szCs w:val="13"/>
               </w:rPr>
             </w:pPr>
-            <w:bookmarkStart w:id="274" w:name="TotalA12"/>
-            <w:bookmarkEnd w:id="274"/>
+            <w:bookmarkStart w:id="294" w:name="TotalA12"/>
+            <w:bookmarkEnd w:id="294"/>
           </w:p>
         </w:tc>
         <w:tc>
@@ -6721,8 +7127,8 @@
                 <w:szCs w:val="13"/>
               </w:rPr>
             </w:pPr>
-            <w:bookmarkStart w:id="275" w:name="sampleA12"/>
-            <w:bookmarkEnd w:id="275"/>
+            <w:bookmarkStart w:id="295" w:name="sampleA12"/>
+            <w:bookmarkEnd w:id="295"/>
           </w:p>
         </w:tc>
         <w:tc>
@@ -6739,8 +7145,8 @@
                 <w:szCs w:val="13"/>
               </w:rPr>
             </w:pPr>
-            <w:bookmarkStart w:id="276" w:name="WeighingB12"/>
-            <w:bookmarkEnd w:id="276"/>
+            <w:bookmarkStart w:id="296" w:name="WeighingB12"/>
+            <w:bookmarkEnd w:id="296"/>
           </w:p>
         </w:tc>
         <w:tc>
@@ -6757,8 +7163,8 @@
                 <w:szCs w:val="13"/>
               </w:rPr>
             </w:pPr>
-            <w:bookmarkStart w:id="277" w:name="TotalB12"/>
-            <w:bookmarkEnd w:id="277"/>
+            <w:bookmarkStart w:id="297" w:name="TotalB12"/>
+            <w:bookmarkEnd w:id="297"/>
           </w:p>
         </w:tc>
         <w:tc>
@@ -6775,8 +7181,8 @@
                 <w:szCs w:val="13"/>
               </w:rPr>
             </w:pPr>
-            <w:bookmarkStart w:id="278" w:name="sampleB12"/>
-            <w:bookmarkEnd w:id="278"/>
+            <w:bookmarkStart w:id="298" w:name="sampleB12"/>
+            <w:bookmarkEnd w:id="298"/>
           </w:p>
         </w:tc>
       </w:tr>
@@ -6799,8 +7205,8 @@
                 <w:szCs w:val="16"/>
               </w:rPr>
             </w:pPr>
-            <w:bookmarkStart w:id="279" w:name="Description13"/>
-            <w:bookmarkEnd w:id="279"/>
+            <w:bookmarkStart w:id="299" w:name="Description13"/>
+            <w:bookmarkEnd w:id="299"/>
           </w:p>
         </w:tc>
         <w:tc>
@@ -6816,8 +7222,8 @@
                 <w:szCs w:val="18"/>
               </w:rPr>
             </w:pPr>
-            <w:bookmarkStart w:id="280" w:name="Component13"/>
-            <w:bookmarkEnd w:id="280"/>
+            <w:bookmarkStart w:id="300" w:name="Component13"/>
+            <w:bookmarkEnd w:id="300"/>
           </w:p>
         </w:tc>
         <w:tc>
@@ -6834,8 +7240,8 @@
                 <w:szCs w:val="13"/>
               </w:rPr>
             </w:pPr>
-            <w:bookmarkStart w:id="281" w:name="WeighingA13"/>
-            <w:bookmarkEnd w:id="281"/>
+            <w:bookmarkStart w:id="301" w:name="WeighingA13"/>
+            <w:bookmarkEnd w:id="301"/>
           </w:p>
         </w:tc>
         <w:tc>
@@ -6852,8 +7258,8 @@
                 <w:szCs w:val="13"/>
               </w:rPr>
             </w:pPr>
-            <w:bookmarkStart w:id="282" w:name="TotalA13"/>
-            <w:bookmarkEnd w:id="282"/>
+            <w:bookmarkStart w:id="302" w:name="TotalA13"/>
+            <w:bookmarkEnd w:id="302"/>
           </w:p>
         </w:tc>
         <w:tc>
@@ -6870,8 +7276,8 @@
                 <w:szCs w:val="13"/>
               </w:rPr>
             </w:pPr>
-            <w:bookmarkStart w:id="283" w:name="sampleA13"/>
-            <w:bookmarkEnd w:id="283"/>
+            <w:bookmarkStart w:id="303" w:name="sampleA13"/>
+            <w:bookmarkEnd w:id="303"/>
           </w:p>
         </w:tc>
         <w:tc>
@@ -6888,8 +7294,8 @@
                 <w:szCs w:val="13"/>
               </w:rPr>
             </w:pPr>
-            <w:bookmarkStart w:id="284" w:name="WeighingB13"/>
-            <w:bookmarkEnd w:id="284"/>
+            <w:bookmarkStart w:id="304" w:name="WeighingB13"/>
+            <w:bookmarkEnd w:id="304"/>
           </w:p>
         </w:tc>
         <w:tc>
@@ -6906,8 +7312,8 @@
                 <w:szCs w:val="13"/>
               </w:rPr>
             </w:pPr>
-            <w:bookmarkStart w:id="285" w:name="TotalB13"/>
-            <w:bookmarkEnd w:id="285"/>
+            <w:bookmarkStart w:id="305" w:name="TotalB13"/>
+            <w:bookmarkEnd w:id="305"/>
           </w:p>
         </w:tc>
         <w:tc>
@@ -6924,8 +7330,8 @@
                 <w:szCs w:val="13"/>
               </w:rPr>
             </w:pPr>
-            <w:bookmarkStart w:id="286" w:name="sampleB13"/>
-            <w:bookmarkEnd w:id="286"/>
+            <w:bookmarkStart w:id="306" w:name="sampleB13"/>
+            <w:bookmarkEnd w:id="306"/>
           </w:p>
         </w:tc>
       </w:tr>
@@ -6948,8 +7354,8 @@
                 <w:szCs w:val="16"/>
               </w:rPr>
             </w:pPr>
-            <w:bookmarkStart w:id="287" w:name="Description14"/>
-            <w:bookmarkEnd w:id="287"/>
+            <w:bookmarkStart w:id="307" w:name="Description14"/>
+            <w:bookmarkEnd w:id="307"/>
           </w:p>
         </w:tc>
         <w:tc>
@@ -6965,8 +7371,8 @@
                 <w:szCs w:val="18"/>
               </w:rPr>
             </w:pPr>
-            <w:bookmarkStart w:id="288" w:name="Component14"/>
-            <w:bookmarkEnd w:id="288"/>
+            <w:bookmarkStart w:id="308" w:name="Component14"/>
+            <w:bookmarkEnd w:id="308"/>
           </w:p>
         </w:tc>
         <w:tc>
@@ -6983,8 +7389,8 @@
                 <w:szCs w:val="13"/>
               </w:rPr>
             </w:pPr>
-            <w:bookmarkStart w:id="289" w:name="WeighingA14"/>
-            <w:bookmarkEnd w:id="289"/>
+            <w:bookmarkStart w:id="309" w:name="WeighingA14"/>
+            <w:bookmarkEnd w:id="309"/>
           </w:p>
         </w:tc>
         <w:tc>
@@ -7001,8 +7407,8 @@
                 <w:szCs w:val="13"/>
               </w:rPr>
             </w:pPr>
-            <w:bookmarkStart w:id="290" w:name="TotalA14"/>
-            <w:bookmarkEnd w:id="290"/>
+            <w:bookmarkStart w:id="310" w:name="TotalA14"/>
+            <w:bookmarkEnd w:id="310"/>
           </w:p>
         </w:tc>
         <w:tc>
@@ -7019,8 +7425,8 @@
                 <w:szCs w:val="13"/>
               </w:rPr>
             </w:pPr>
-            <w:bookmarkStart w:id="291" w:name="sampleA14"/>
-            <w:bookmarkEnd w:id="291"/>
+            <w:bookmarkStart w:id="311" w:name="sampleA14"/>
+            <w:bookmarkEnd w:id="311"/>
           </w:p>
         </w:tc>
         <w:tc>
@@ -7037,8 +7443,8 @@
                 <w:szCs w:val="13"/>
               </w:rPr>
             </w:pPr>
-            <w:bookmarkStart w:id="292" w:name="WeighingB14"/>
-            <w:bookmarkEnd w:id="292"/>
+            <w:bookmarkStart w:id="312" w:name="WeighingB14"/>
+            <w:bookmarkEnd w:id="312"/>
           </w:p>
         </w:tc>
         <w:tc>
@@ -7055,8 +7461,8 @@
                 <w:szCs w:val="13"/>
               </w:rPr>
             </w:pPr>
-            <w:bookmarkStart w:id="293" w:name="TotalB14"/>
-            <w:bookmarkEnd w:id="293"/>
+            <w:bookmarkStart w:id="313" w:name="TotalB14"/>
+            <w:bookmarkEnd w:id="313"/>
           </w:p>
         </w:tc>
         <w:tc>
@@ -7073,8 +7479,8 @@
                 <w:szCs w:val="13"/>
               </w:rPr>
             </w:pPr>
-            <w:bookmarkStart w:id="294" w:name="sampleB14"/>
-            <w:bookmarkEnd w:id="294"/>
+            <w:bookmarkStart w:id="314" w:name="sampleB14"/>
+            <w:bookmarkEnd w:id="314"/>
           </w:p>
         </w:tc>
       </w:tr>

</xml_diff>